<commit_message>
warunek wygranej uzupelniony o sytuacje bez dostepnego ruchu; dodanie zasad; naprawa licznikow; zmiany stylistyczne; sprawdzenie logiki gry w roznych sytuacjach
</commit_message>
<xml_diff>
--- a/dokumentacja.docx
+++ b/dokumentacja.docx
@@ -86,15 +86,28 @@
     <w:p>
       <w:r>
         <w:rPr/>
-        <w:t>Utworzenie funkcji “</w:t>
-      </w:r>
-      <w:r>
-        <w:rPr/>
-        <w:t>czysc</w:t>
-      </w:r>
-      <w:r>
-        <w:rPr/>
-        <w:t>”</w:t>
+        <w:t>Utworzenie funkcji</w:t>
+      </w:r>
+      <w:r>
+        <w:rPr>
+          <w:i w:val="1"/>
+          <w:iCs w:val="1"/>
+        </w:rPr>
+        <w:t xml:space="preserve"> </w:t>
+      </w:r>
+      <w:r>
+        <w:rPr>
+          <w:i w:val="1"/>
+          <w:iCs w:val="1"/>
+        </w:rPr>
+        <w:t>czys</w:t>
+      </w:r>
+      <w:r>
+        <w:rPr>
+          <w:i w:val="1"/>
+          <w:iCs w:val="1"/>
+        </w:rPr>
+        <w:t>c</w:t>
       </w:r>
       <w:r>
         <w:rPr/>
@@ -106,11 +119,22 @@
       </w:r>
       <w:r>
         <w:rPr/>
-        <w:t>planszę warcabów uzależnioną od stanu tablicy piony</w:t>
+        <w:t xml:space="preserve">planszę warcabów uzależnioną od stanu tablicy </w:t>
+      </w:r>
+      <w:r>
+        <w:rPr>
+          <w:i w:val="1"/>
+          <w:iCs w:val="1"/>
+        </w:rPr>
+        <w:t>piony</w:t>
       </w:r>
       <w:r>
         <w:rPr/>
         <w:t xml:space="preserve"> i wstępnej wersji funkcji odpowiadającej za przesuwanie (póki co bez jakichkolwiek zabezpieczeń)</w:t>
+      </w:r>
+      <w:r>
+        <w:rPr/>
+        <w:t>.</w:t>
       </w:r>
     </w:p>
     <w:p/>
@@ -215,6 +239,8 @@
         <w:rPr>
           <w:b w:val="0"/>
           <w:bCs w:val="0"/>
+          <w:i w:val="1"/>
+          <w:iCs w:val="1"/>
           <w:sz w:val="24"/>
           <w:szCs w:val="24"/>
           <w:u w:val="none"/>
@@ -239,7 +265,143 @@
           <w:szCs w:val="24"/>
           <w:u w:val="none"/>
         </w:rPr>
-        <w:t>. Gra jest już funkcjonalna.</w:t>
+        <w:t>. Gra jest już</w:t>
+      </w:r>
+      <w:r>
+        <w:rPr>
+          <w:b w:val="0"/>
+          <w:bCs w:val="0"/>
+          <w:sz w:val="24"/>
+          <w:szCs w:val="24"/>
+          <w:u w:val="none"/>
+        </w:rPr>
+        <w:t xml:space="preserve"> (prawie)</w:t>
+      </w:r>
+      <w:r>
+        <w:rPr>
+          <w:b w:val="0"/>
+          <w:bCs w:val="0"/>
+          <w:sz w:val="24"/>
+          <w:szCs w:val="24"/>
+          <w:u w:val="none"/>
+        </w:rPr>
+        <w:t xml:space="preserve"> funkcjonalna.</w:t>
+      </w:r>
+    </w:p>
+    <w:p>
+      <w:pPr>
+        <w:rPr>
+          <w:b w:val="0"/>
+          <w:bCs w:val="0"/>
+          <w:sz w:val="24"/>
+          <w:szCs w:val="24"/>
+          <w:u w:val="none"/>
+        </w:rPr>
+      </w:pPr>
+    </w:p>
+    <w:p>
+      <w:r>
+        <w:rPr>
+          <w:b w:val="0"/>
+          <w:bCs w:val="0"/>
+          <w:i w:val="0"/>
+          <w:iCs w:val="0"/>
+          <w:sz w:val="36"/>
+          <w:szCs w:val="36"/>
+          <w:u w:val="single"/>
+        </w:rPr>
+        <w:t>30.09.2026 r.</w:t>
+      </w:r>
+    </w:p>
+    <w:p>
+      <w:r>
+        <w:rPr>
+          <w:b w:val="0"/>
+          <w:bCs w:val="0"/>
+          <w:i w:val="0"/>
+          <w:iCs w:val="0"/>
+          <w:sz w:val="24"/>
+          <w:szCs w:val="24"/>
+          <w:u w:val="none"/>
+        </w:rPr>
+        <w:t xml:space="preserve">Wstawienie na początku gry kilkupunktowych zasad; drobne poprawki stylistyczne; poprawa logiki gry w tym uzupełnienie </w:t>
+      </w:r>
+      <w:r>
+        <w:rPr>
+          <w:b w:val="0"/>
+          <w:bCs w:val="0"/>
+          <w:i w:val="0"/>
+          <w:iCs w:val="0"/>
+          <w:sz w:val="24"/>
+          <w:szCs w:val="24"/>
+          <w:u w:val="none"/>
+        </w:rPr>
+        <w:t>o część warunku zwycięstwa - brak możliwego ruchu przeciwnika i naprawa liczników pionów na planszy</w:t>
+      </w:r>
+    </w:p>
+    <w:p>
+      <w:pPr>
+        <w:rPr>
+          <w:b w:val="0"/>
+          <w:bCs w:val="0"/>
+          <w:i w:val="0"/>
+          <w:iCs w:val="0"/>
+          <w:sz w:val="24"/>
+          <w:szCs w:val="24"/>
+          <w:u w:val="none"/>
+        </w:rPr>
+      </w:pPr>
+    </w:p>
+    <w:p>
+      <w:r>
+        <w:rPr>
+          <w:b w:val="0"/>
+          <w:bCs w:val="0"/>
+          <w:i w:val="0"/>
+          <w:iCs w:val="0"/>
+          <w:sz w:val="36"/>
+          <w:szCs w:val="36"/>
+          <w:u w:val="none"/>
+        </w:rPr>
+        <w:t>KONIEC PROJEKTU</w:t>
+      </w:r>
+    </w:p>
+    <w:p>
+      <w:pPr>
+        <w:rPr>
+          <w:b w:val="0"/>
+          <w:bCs w:val="0"/>
+          <w:i w:val="0"/>
+          <w:iCs w:val="0"/>
+          <w:sz w:val="36"/>
+          <w:szCs w:val="36"/>
+          <w:u w:val="none"/>
+        </w:rPr>
+      </w:pPr>
+    </w:p>
+    <w:p>
+      <w:pPr>
+        <w:rPr>
+          <w:b w:val="0"/>
+          <w:bCs w:val="0"/>
+          <w:i w:val="0"/>
+          <w:iCs w:val="0"/>
+          <w:sz w:val="24"/>
+          <w:szCs w:val="24"/>
+          <w:u w:val="none"/>
+        </w:rPr>
+      </w:pPr>
+      <w:r>
+        <w:rPr>
+          <w:b w:val="0"/>
+          <w:bCs w:val="0"/>
+          <w:i w:val="0"/>
+          <w:iCs w:val="0"/>
+          <w:sz w:val="24"/>
+          <w:szCs w:val="24"/>
+          <w:u w:val="none"/>
+        </w:rPr>
+        <w:t>Wykonał Mateusz Antczak klasa 1d na dzień rozpoczęcia, a 2d na dzień zakończenia projektu.</w:t>
       </w:r>
     </w:p>
     <w:sectPr>
@@ -247,9 +409,151 @@
       <w:pgMar w:top="1440" w:right="1440" w:bottom="1440" w:left="1440" w:header="708" w:footer="708" w:gutter="0"/>
       <w:cols w:space="708"/>
       <w:docGrid w:linePitch="360"/>
+      <w:headerReference w:type="default" r:id="Rbe5f916d5e88448e"/>
+      <w:footerReference w:type="default" r:id="R7c6785b2cb164fa2"/>
     </w:sectPr>
   </w:body>
 </w:document>
+</file>
+
+<file path=word/footer.xml><?xml version="1.0" encoding="utf-8"?>
+<w:ftr xmlns:w14="http://schemas.microsoft.com/office/word/2010/wordml" xmlns:w="http://schemas.openxmlformats.org/wordprocessingml/2006/main">
+  <w:tbl>
+    <w:tblPr>
+      <w:tblStyle w:val="TableNormal"/>
+      <w:bidiVisual w:val="0"/>
+      <w:tblW w:w="0" w:type="auto"/>
+      <w:tblLook w:val="06A0" w:firstRow="1" w:lastRow="0" w:firstColumn="1" w:lastColumn="0" w:noHBand="1" w:noVBand="1"/>
+    </w:tblPr>
+    <w:tblGrid>
+      <w:gridCol w:w="3005"/>
+      <w:gridCol w:w="3005"/>
+      <w:gridCol w:w="3005"/>
+    </w:tblGrid>
+    <w:tr>
+      <w:trPr>
+        <w:trHeight w:val="300"/>
+      </w:trPr>
+      <w:tc>
+        <w:tcPr>
+          <w:tcW w:w="3005" w:type="dxa"/>
+          <w:tcMar/>
+        </w:tcPr>
+        <w:p>
+          <w:pPr>
+            <w:pStyle w:val="Header"/>
+            <w:bidi w:val="0"/>
+            <w:ind w:left="-115"/>
+            <w:jc w:val="left"/>
+          </w:pPr>
+        </w:p>
+      </w:tc>
+      <w:tc>
+        <w:tcPr>
+          <w:tcW w:w="3005" w:type="dxa"/>
+          <w:tcMar/>
+        </w:tcPr>
+        <w:p>
+          <w:pPr>
+            <w:pStyle w:val="Header"/>
+            <w:bidi w:val="0"/>
+            <w:jc w:val="center"/>
+          </w:pPr>
+        </w:p>
+      </w:tc>
+      <w:tc>
+        <w:tcPr>
+          <w:tcW w:w="3005" w:type="dxa"/>
+          <w:tcMar/>
+        </w:tcPr>
+        <w:p>
+          <w:pPr>
+            <w:pStyle w:val="Header"/>
+            <w:bidi w:val="0"/>
+            <w:ind w:right="-115"/>
+            <w:jc w:val="right"/>
+          </w:pPr>
+        </w:p>
+      </w:tc>
+    </w:tr>
+  </w:tbl>
+  <w:p>
+    <w:pPr>
+      <w:pStyle w:val="Footer"/>
+      <w:bidi w:val="0"/>
+    </w:pPr>
+  </w:p>
+</w:ftr>
+</file>
+
+<file path=word/header.xml><?xml version="1.0" encoding="utf-8"?>
+<w:hdr xmlns:w14="http://schemas.microsoft.com/office/word/2010/wordml" xmlns:w="http://schemas.openxmlformats.org/wordprocessingml/2006/main">
+  <w:tbl>
+    <w:tblPr>
+      <w:tblStyle w:val="TableNormal"/>
+      <w:bidiVisual w:val="0"/>
+      <w:tblW w:w="0" w:type="auto"/>
+      <w:tblLook w:val="06A0" w:firstRow="1" w:lastRow="0" w:firstColumn="1" w:lastColumn="0" w:noHBand="1" w:noVBand="1"/>
+    </w:tblPr>
+    <w:tblGrid>
+      <w:gridCol w:w="3005"/>
+      <w:gridCol w:w="3005"/>
+      <w:gridCol w:w="3005"/>
+    </w:tblGrid>
+    <w:tr>
+      <w:trPr>
+        <w:trHeight w:val="300"/>
+      </w:trPr>
+      <w:tc>
+        <w:tcPr>
+          <w:tcW w:w="3005" w:type="dxa"/>
+          <w:tcMar/>
+        </w:tcPr>
+        <w:p>
+          <w:pPr>
+            <w:pStyle w:val="Header"/>
+            <w:bidi w:val="0"/>
+            <w:ind w:left="-115"/>
+            <w:jc w:val="left"/>
+          </w:pPr>
+        </w:p>
+      </w:tc>
+      <w:tc>
+        <w:tcPr>
+          <w:tcW w:w="3005" w:type="dxa"/>
+          <w:tcMar/>
+        </w:tcPr>
+        <w:p>
+          <w:pPr>
+            <w:pStyle w:val="Header"/>
+            <w:bidi w:val="0"/>
+            <w:jc w:val="center"/>
+          </w:pPr>
+        </w:p>
+      </w:tc>
+      <w:tc>
+        <w:tcPr>
+          <w:tcW w:w="3005" w:type="dxa"/>
+          <w:tcMar/>
+        </w:tcPr>
+        <w:p>
+          <w:pPr>
+            <w:pStyle w:val="Header"/>
+            <w:bidi w:val="0"/>
+            <w:ind w:right="-115"/>
+            <w:jc w:val="right"/>
+          </w:pPr>
+        </w:p>
+      </w:tc>
+    </w:tr>
+  </w:tbl>
+  <w:p>
+    <w:pPr>
+      <w:pStyle w:val="Header"/>
+      <w:bidi w:val="0"/>
+    </w:pPr>
+  </w:p>
+</w:hdr>
 </file>
 
 <file path=word/styles.xml><?xml version="1.0" encoding="utf-8"?>
@@ -673,6 +977,60 @@
     <w:semiHidden/>
     <w:unhideWhenUsed/>
   </w:style>
+  <w:style w:type="paragraph" w:styleId="Header">
+    <w:uiPriority w:val="99"/>
+    <w:name w:val="header"/>
+    <w:basedOn w:val="Normal"/>
+    <w:unhideWhenUsed/>
+    <w:rsid w:val="54BB0703"/>
+    <w:pPr>
+      <w:tabs>
+        <w:tab w:val="center" w:leader="none" w:pos="4680"/>
+        <w:tab w:val="right" w:leader="none" w:pos="9360"/>
+      </w:tabs>
+      <w:spacing w:after="0" w:line="240" w:lineRule="auto"/>
+    </w:pPr>
+  </w:style>
+  <w:style w:type="paragraph" w:styleId="Footer">
+    <w:uiPriority w:val="99"/>
+    <w:name w:val="footer"/>
+    <w:basedOn w:val="Normal"/>
+    <w:unhideWhenUsed/>
+    <w:rsid w:val="54BB0703"/>
+    <w:pPr>
+      <w:tabs>
+        <w:tab w:val="center" w:leader="none" w:pos="4680"/>
+        <w:tab w:val="right" w:leader="none" w:pos="9360"/>
+      </w:tabs>
+      <w:spacing w:after="0" w:line="240" w:lineRule="auto"/>
+    </w:pPr>
+  </w:style>
+  <w:style xmlns:w="http://schemas.openxmlformats.org/wordprocessingml/2006/main" w:type="table" w:styleId="TableGrid">
+    <w:name xmlns:w="http://schemas.openxmlformats.org/wordprocessingml/2006/main" w:val="Table Grid"/>
+    <w:basedOn xmlns:w="http://schemas.openxmlformats.org/wordprocessingml/2006/main" w:val="TableNormal"/>
+    <w:uiPriority xmlns:w="http://schemas.openxmlformats.org/wordprocessingml/2006/main" w:val="59"/>
+    <w:rsid xmlns:w="http://schemas.openxmlformats.org/wordprocessingml/2006/main" w:val="00FB4123"/>
+    <w:pPr xmlns:w="http://schemas.openxmlformats.org/wordprocessingml/2006/main">
+      <w:spacing w:after="0" w:line="240" w:lineRule="auto"/>
+    </w:pPr>
+    <w:tblPr xmlns:w="http://schemas.openxmlformats.org/wordprocessingml/2006/main">
+      <w:tblInd w:w="0" w:type="dxa"/>
+      <w:tblBorders>
+        <w:top w:val="single" w:color="000000" w:themeColor="text1" w:sz="4" w:space="0"/>
+        <w:left w:val="single" w:color="000000" w:themeColor="text1" w:sz="4" w:space="0"/>
+        <w:bottom w:val="single" w:color="000000" w:themeColor="text1" w:sz="4" w:space="0"/>
+        <w:right w:val="single" w:color="000000" w:themeColor="text1" w:sz="4" w:space="0"/>
+        <w:insideH w:val="single" w:color="000000" w:themeColor="text1" w:sz="4" w:space="0"/>
+        <w:insideV w:val="single" w:color="000000" w:themeColor="text1" w:sz="4" w:space="0"/>
+      </w:tblBorders>
+      <w:tblCellMar>
+        <w:top w:w="0" w:type="dxa"/>
+        <w:left w:w="108" w:type="dxa"/>
+        <w:bottom w:w="0" w:type="dxa"/>
+        <w:right w:w="108" w:type="dxa"/>
+      </w:tblCellMar>
+    </w:tblPr>
+  </w:style>
 </w:styles>
 </file>
 

</xml_diff>